<commit_message>
fix: replace inaccurate "conservative" wording in T/R ratio help text (v1.2.8)
A reviewer noted that assuming a 95% Expected Test/Reference ratio is
not universally conservative: a larger true difference from 100%
still needs a larger sample size regardless of the value assumed for
planning. Replaced "conservative" with "conventional" in both help
text locations describing the 95% default.

Co-Authored-By: Claude Sonnet 5 <noreply@anthropic.com>
</commit_message>
<xml_diff>
--- a/validation/NCA_Assistant_IQOQPQ.docx
+++ b/validation/NCA_Assistant_IQOQPQ.docx
@@ -21,7 +21,7 @@
           <w:sz w:val="48"/>
           <w:szCs w:val="48"/>
         </w:rPr>
-        <w:t xml:space="preserve">NCA Assistant v1.2.7</w:t>
+        <w:t xml:space="preserve">NCA Assistant v1.2.8</w:t>
       </w:r>
     </w:p>
     <w:p>
@@ -357,7 +357,7 @@
           <w:sz w:val="22"/>
           <w:szCs w:val="22"/>
         </w:rPr>
-        <w:t xml:space="preserve">This protocol defines the IQ, OQ, and PQ procedures for NCA Assistant v1.2.7. Execute: Rscript validation/validation.R</w:t>
+        <w:t xml:space="preserve">This protocol defines the IQ, OQ, and PQ procedures for NCA Assistant v1.2.8. Execute: Rscript validation/validation.R</w:t>
       </w:r>
     </w:p>
     <w:p>
@@ -22756,7 +22756,7 @@
                 <w:sz w:val="18"/>
                 <w:szCs w:val="18"/>
               </w:rPr>
-              <w:t xml:space="preserve">APP_VERSION is 1.2.7</w:t>
+              <w:t xml:space="preserve">APP_VERSION is 1.2.8</w:t>
             </w:r>
           </w:p>
         </w:tc>
@@ -22784,7 +22784,7 @@
                 <w:sz w:val="18"/>
                 <w:szCs w:val="18"/>
               </w:rPr>
-              <w:t xml:space="preserve">=='1.2.7'</w:t>
+              <w:t xml:space="preserve">=='1.2.8'</w:t>
             </w:r>
           </w:p>
         </w:tc>
@@ -22812,7 +22812,7 @@
                 <w:sz w:val="18"/>
                 <w:szCs w:val="18"/>
               </w:rPr>
-              <w:t xml:space="preserve">1.2.7</w:t>
+              <w:t xml:space="preserve">1.2.8</w:t>
             </w:r>
           </w:p>
         </w:tc>

</xml_diff>